<commit_message>
feat: point forecast explorer and writeup at 14-day forecast
Co-Authored-By: Claude Opus 5.5 <noreply@anthropic.com>
</commit_message>
<xml_diff>
--- a/artifacts/2026_massachusetts_legislative_forecast.docx
+++ b/artifacts/2026_massachusetts_legislative_forecast.docx
@@ -27,10 +27,10 @@
     </w:p>
     <w:p>
       <w:r>
-        <w:t xml:space="preserve">The current 60-day snapshot covers 46 contested Massachusetts legislative races in the November 3, 2026 election. </w:t>
+        <w:t xml:space="preserve">The current 14-day snapshot covers 46 contested Massachusetts legislative races in the November 3, 2026 election. </w:t>
       </w:r>
       <w:r>
-        <w:t xml:space="preserve">The closest contest is 9th Norfolk State Representative, where Thomas R. Melville (D-Medfield) has a 45.1% Democratic win probability. </w:t>
+        <w:t xml:space="preserve">The closest contest is 8th Bristol State Representative, where Steven J. Ouellette (D-Westport) has a 56.4% Democratic win probability. </w:t>
       </w:r>
       <w:r>
         <w:t>Four races fall between 40% and 60%; the model favors Democrats in 32 contests and their opponents in 14.</w:t>
@@ -44,7 +44,7 @@
         <w:t xml:space="preserve">Contested race aggregate  </w:t>
       </w:r>
       <w:r>
-        <w:t>Posterior draws average 31.0 Democratic wins, with a median of 31 and a 90% range of 28 to 34. These are wins among the 46 listed contests, not total chamber seats.</w:t>
+        <w:t>Posterior draws average 31.3 Democratic wins, with a median of 31 and a 90% range of 28 to 34. These are wins among the 46 listed contests, not total chamber seats.</w:t>
       </w:r>
     </w:p>
     <w:p>
@@ -55,7 +55,7 @@
         <w:t xml:space="preserve">Snapshot scope  </w:t>
       </w:r>
       <w:r>
-        <w:t>Finance data were frozen at the 2026-09-04 cutoff. All target races had complete finance data, so each used the selected PVI, incumbency, and fundraising model. No target generated a support warning.</w:t>
+        <w:t>Finance data were frozen at the 2026-10-20 cutoff. All target races had complete finance data, so each used the selected PVI, incumbency, and fundraising model. No target generated a support warning.</w:t>
       </w:r>
     </w:p>
     <w:p>
@@ -418,7 +418,7 @@
                 <w:color w:val="000000"/>
                 <w:sz w:val="16"/>
               </w:rPr>
-              <w:t>9th Norfolk</w:t>
+              <w:t>8th Bristol</w:t>
             </w:r>
           </w:p>
         </w:tc>
@@ -445,7 +445,13 @@
                 <w:color w:val="000000"/>
                 <w:sz w:val="16"/>
               </w:rPr>
-              <w:t>Thomas R. Melville (D-Medfield)</w:t>
+              <w:t>Steven J. Ouellette (D-Westport)</w:t>
+            </w:r>
+            <w:r>
+              <w:rPr>
+                <w:vertAlign w:val="superscript"/>
+              </w:rPr>
+              <w:t>*</w:t>
             </w:r>
           </w:p>
         </w:tc>
@@ -472,13 +478,7 @@
                 <w:color w:val="000000"/>
                 <w:sz w:val="16"/>
               </w:rPr>
-              <w:t>Marcus S. Vaughn (R-Wrentham)</w:t>
-            </w:r>
-            <w:r>
-              <w:rPr>
-                <w:vertAlign w:val="superscript"/>
-              </w:rPr>
-              <w:t>*</w:t>
+              <w:t>Jesse W. St. Gelais (R-Acushnet)</w:t>
             </w:r>
           </w:p>
         </w:tc>
@@ -505,7 +505,7 @@
                 <w:color w:val="000000"/>
                 <w:sz w:val="16"/>
               </w:rPr>
-              <w:t>45.1%</w:t>
+              <w:t>56.4%</w:t>
             </w:r>
           </w:p>
         </w:tc>
@@ -532,7 +532,7 @@
                 <w:color w:val="000000"/>
                 <w:sz w:val="16"/>
               </w:rPr>
-              <w:t>-1.5</w:t>
+              <w:t>+2.2</w:t>
             </w:r>
           </w:p>
         </w:tc>
@@ -559,7 +559,7 @@
                 <w:color w:val="000000"/>
                 <w:sz w:val="16"/>
               </w:rPr>
-              <w:t>[-23.3, +20.5]</w:t>
+              <w:t>[-19.0, +23.5]</w:t>
             </w:r>
           </w:p>
         </w:tc>
@@ -648,7 +648,7 @@
                 <w:color w:val="000000"/>
                 <w:sz w:val="16"/>
               </w:rPr>
-              <w:t>3rd Barnstable</w:t>
+              <w:t>9th Essex</w:t>
             </w:r>
           </w:p>
         </w:tc>
@@ -676,7 +676,7 @@
                 <w:color w:val="000000"/>
                 <w:sz w:val="16"/>
               </w:rPr>
-              <w:t>Jack Peter Richardson (D-Falmouth)</w:t>
+              <w:t>Peter Meaney (D-Lynn)</w:t>
             </w:r>
           </w:p>
         </w:tc>
@@ -704,7 +704,7 @@
                 <w:color w:val="000000"/>
                 <w:sz w:val="16"/>
               </w:rPr>
-              <w:t>David T. Vieira (R-Falmouth)</w:t>
+              <w:t>Donald H. Wong (R-Saugus)</w:t>
             </w:r>
             <w:r>
               <w:rPr>
@@ -738,7 +738,7 @@
                 <w:color w:val="000000"/>
                 <w:sz w:val="16"/>
               </w:rPr>
-              <w:t>55.9%</w:t>
+              <w:t>42.7%</w:t>
             </w:r>
           </w:p>
         </w:tc>
@@ -766,7 +766,7 @@
                 <w:color w:val="000000"/>
                 <w:sz w:val="16"/>
               </w:rPr>
-              <w:t>+1.8</w:t>
+              <w:t>-2.5</w:t>
             </w:r>
           </w:p>
         </w:tc>
@@ -794,7 +794,7 @@
                 <w:color w:val="000000"/>
                 <w:sz w:val="16"/>
               </w:rPr>
-              <w:t>[-20.2, +23.6]</w:t>
+              <w:t>[-23.6, +18.3]</w:t>
             </w:r>
           </w:p>
         </w:tc>
@@ -880,7 +880,7 @@
                 <w:color w:val="000000"/>
                 <w:sz w:val="16"/>
               </w:rPr>
-              <w:t>8th Bristol</w:t>
+              <w:t>9th Norfolk</w:t>
             </w:r>
           </w:p>
         </w:tc>
@@ -907,7 +907,34 @@
                 <w:color w:val="000000"/>
                 <w:sz w:val="16"/>
               </w:rPr>
-              <w:t>Steven J. Ouellette (D-Westport)</w:t>
+              <w:t>Thomas R. Melville (D-Medfield)</w:t>
+            </w:r>
+          </w:p>
+        </w:tc>
+        <w:tc>
+          <w:tcPr>
+            <w:tcW w:type="dxa" w:w="2376"/>
+            <w:vAlign w:val="center"/>
+            <w:tcMar>
+              <w:top w:w="70" w:type="dxa"/>
+              <w:start w:w="65" w:type="dxa"/>
+              <w:bottom w:w="70" w:type="dxa"/>
+              <w:end w:w="65" w:type="dxa"/>
+            </w:tcMar>
+          </w:tcPr>
+          <w:p>
+            <w:pPr>
+              <w:spacing w:after="0" w:line="240" w:lineRule="auto"/>
+              <w:jc w:val="left"/>
+            </w:pPr>
+            <w:r>
+              <w:rPr>
+                <w:rFonts w:ascii="Arial" w:hAnsi="Arial"/>
+                <w:b w:val="0"/>
+                <w:color w:val="000000"/>
+                <w:sz w:val="16"/>
+              </w:rPr>
+              <w:t>Marcus S. Vaughn (R-Wrentham)</w:t>
             </w:r>
             <w:r>
               <w:rPr>
@@ -919,33 +946,6 @@
         </w:tc>
         <w:tc>
           <w:tcPr>
-            <w:tcW w:type="dxa" w:w="2376"/>
-            <w:vAlign w:val="center"/>
-            <w:tcMar>
-              <w:top w:w="70" w:type="dxa"/>
-              <w:start w:w="65" w:type="dxa"/>
-              <w:bottom w:w="70" w:type="dxa"/>
-              <w:end w:w="65" w:type="dxa"/>
-            </w:tcMar>
-          </w:tcPr>
-          <w:p>
-            <w:pPr>
-              <w:spacing w:after="0" w:line="240" w:lineRule="auto"/>
-              <w:jc w:val="left"/>
-            </w:pPr>
-            <w:r>
-              <w:rPr>
-                <w:rFonts w:ascii="Arial" w:hAnsi="Arial"/>
-                <w:b w:val="0"/>
-                <w:color w:val="000000"/>
-                <w:sz w:val="16"/>
-              </w:rPr>
-              <w:t>Jesse W. St. Gelais (R-Acushnet)</w:t>
-            </w:r>
-          </w:p>
-        </w:tc>
-        <w:tc>
-          <w:tcPr>
             <w:tcW w:type="dxa" w:w="893"/>
             <w:vAlign w:val="center"/>
             <w:tcMar>
@@ -967,7 +967,7 @@
                 <w:color w:val="000000"/>
                 <w:sz w:val="16"/>
               </w:rPr>
-              <w:t>57.5%</w:t>
+              <w:t>42.4%</w:t>
             </w:r>
           </w:p>
         </w:tc>
@@ -994,7 +994,7 @@
                 <w:color w:val="000000"/>
                 <w:sz w:val="16"/>
               </w:rPr>
-              <w:t>+2.7</w:t>
+              <w:t>-2.1</w:t>
             </w:r>
           </w:p>
         </w:tc>
@@ -1021,7 +1021,7 @@
                 <w:color w:val="000000"/>
                 <w:sz w:val="16"/>
               </w:rPr>
-              <w:t>[-19.5, +24.2]</w:t>
+              <w:t>[-23.1, +19.2]</w:t>
             </w:r>
           </w:p>
         </w:tc>
@@ -1110,7 +1110,7 @@
                 <w:color w:val="000000"/>
                 <w:sz w:val="16"/>
               </w:rPr>
-              <w:t>9th Bristol</w:t>
+              <w:t>3rd Barnstable</w:t>
             </w:r>
           </w:p>
         </w:tc>
@@ -1138,7 +1138,7 @@
                 <w:color w:val="000000"/>
                 <w:sz w:val="16"/>
               </w:rPr>
-              <w:t>Edward M. Pacheco (D-Dartmouth)</w:t>
+              <w:t>Jack Peter Richardson (D-Falmouth)</w:t>
             </w:r>
           </w:p>
         </w:tc>
@@ -1166,7 +1166,13 @@
                 <w:color w:val="000000"/>
                 <w:sz w:val="16"/>
               </w:rPr>
-              <w:t>Chester M. Tam (R-Dartmouth)</w:t>
+              <w:t>David T. Vieira (R-Falmouth)</w:t>
+            </w:r>
+            <w:r>
+              <w:rPr>
+                <w:vertAlign w:val="superscript"/>
+              </w:rPr>
+              <w:t>*</w:t>
             </w:r>
           </w:p>
         </w:tc>
@@ -1194,7 +1200,7 @@
                 <w:color w:val="000000"/>
                 <w:sz w:val="16"/>
               </w:rPr>
-              <w:t>60.0%</w:t>
+              <w:t>58.5%</w:t>
             </w:r>
           </w:p>
         </w:tc>
@@ -1222,7 +1228,7 @@
                 <w:color w:val="000000"/>
                 <w:sz w:val="16"/>
               </w:rPr>
-              <w:t>+3.4</w:t>
+              <w:t>+3.0</w:t>
             </w:r>
           </w:p>
         </w:tc>
@@ -1250,7 +1256,7 @@
                 <w:color w:val="000000"/>
                 <w:sz w:val="16"/>
               </w:rPr>
-              <w:t>[-18.2, +25.1]</w:t>
+              <w:t>[-18.0, +24.0]</w:t>
             </w:r>
           </w:p>
         </w:tc>
@@ -1336,7 +1342,7 @@
                 <w:color w:val="000000"/>
                 <w:sz w:val="16"/>
               </w:rPr>
-              <w:t>9th Essex</w:t>
+              <w:t>9th Bristol</w:t>
             </w:r>
           </w:p>
         </w:tc>
@@ -1363,7 +1369,7 @@
                 <w:color w:val="000000"/>
                 <w:sz w:val="16"/>
               </w:rPr>
-              <w:t>Peter Meaney (D-Lynn)</w:t>
+              <w:t>Edward M. Pacheco (D-Dartmouth)</w:t>
             </w:r>
           </w:p>
         </w:tc>
@@ -1390,13 +1396,7 @@
                 <w:color w:val="000000"/>
                 <w:sz w:val="16"/>
               </w:rPr>
-              <w:t>Donald H. Wong (R-Saugus)</w:t>
-            </w:r>
-            <w:r>
-              <w:rPr>
-                <w:vertAlign w:val="superscript"/>
-              </w:rPr>
-              <w:t>*</w:t>
+              <w:t>Chester M. Tam (R-Dartmouth)</w:t>
             </w:r>
           </w:p>
         </w:tc>
@@ -1423,7 +1423,7 @@
                 <w:color w:val="000000"/>
                 <w:sz w:val="16"/>
               </w:rPr>
-              <w:t>37.9%</w:t>
+              <w:t>65.8%</w:t>
             </w:r>
           </w:p>
         </w:tc>
@@ -1450,7 +1450,7 @@
                 <w:color w:val="000000"/>
                 <w:sz w:val="16"/>
               </w:rPr>
-              <w:t>-4.4</w:t>
+              <w:t>+5.3</w:t>
             </w:r>
           </w:p>
         </w:tc>
@@ -1477,7 +1477,7 @@
                 <w:color w:val="000000"/>
                 <w:sz w:val="16"/>
               </w:rPr>
-              <w:t>[-26.0, +17.3]</w:t>
+              <w:t>[-15.5, +26.3]</w:t>
             </w:r>
           </w:p>
         </w:tc>
@@ -1650,7 +1650,7 @@
                 <w:color w:val="000000"/>
                 <w:sz w:val="16"/>
               </w:rPr>
-              <w:t>69.6%</w:t>
+              <w:t>69.7%</w:t>
             </w:r>
           </w:p>
         </w:tc>
@@ -1678,7 +1678,7 @@
                 <w:color w:val="000000"/>
                 <w:sz w:val="16"/>
               </w:rPr>
-              <w:t>+6.9</w:t>
+              <w:t>+6.5</w:t>
             </w:r>
           </w:p>
         </w:tc>
@@ -1706,7 +1706,7 @@
                 <w:color w:val="000000"/>
                 <w:sz w:val="16"/>
               </w:rPr>
-              <w:t>[-14.6, +28.7]</w:t>
+              <w:t>[-14.9, +28.0]</w:t>
             </w:r>
           </w:p>
         </w:tc>
@@ -1879,7 +1879,7 @@
                 <w:color w:val="000000"/>
                 <w:sz w:val="16"/>
               </w:rPr>
-              <w:t>27.6%</w:t>
+              <w:t>26.1%</w:t>
             </w:r>
           </w:p>
         </w:tc>
@@ -1906,7 +1906,7 @@
                 <w:color w:val="000000"/>
                 <w:sz w:val="16"/>
               </w:rPr>
-              <w:t>-7.8</w:t>
+              <w:t>-8.3</w:t>
             </w:r>
           </w:p>
         </w:tc>
@@ -1933,7 +1933,7 @@
                 <w:color w:val="000000"/>
                 <w:sz w:val="16"/>
               </w:rPr>
-              <w:t>[-29.7, +13.8]</w:t>
+              <w:t>[-29.3, +12.5]</w:t>
             </w:r>
           </w:p>
         </w:tc>
@@ -2022,7 +2022,7 @@
                 <w:color w:val="000000"/>
                 <w:sz w:val="16"/>
               </w:rPr>
-              <w:t>20th Middlesex</w:t>
+              <w:t>5th Plymouth</w:t>
             </w:r>
           </w:p>
         </w:tc>
@@ -2050,7 +2050,7 @@
                 <w:color w:val="000000"/>
                 <w:sz w:val="16"/>
               </w:rPr>
-              <w:t>Joseph Markey (D-Lynnfield)</w:t>
+              <w:t>Lori Childs (D-Rockland)</w:t>
             </w:r>
           </w:p>
         </w:tc>
@@ -2078,7 +2078,13 @@
                 <w:color w:val="000000"/>
                 <w:sz w:val="16"/>
               </w:rPr>
-              <w:t>Trevor David Currier (R-Middleton)</w:t>
+              <w:t>David F. DeCoste (R-Norwell)</w:t>
+            </w:r>
+            <w:r>
+              <w:rPr>
+                <w:vertAlign w:val="superscript"/>
+              </w:rPr>
+              <w:t>*</w:t>
             </w:r>
           </w:p>
         </w:tc>
@@ -2106,7 +2112,7 @@
                 <w:color w:val="000000"/>
                 <w:sz w:val="16"/>
               </w:rPr>
-              <w:t>76.6%</w:t>
+              <w:t>25.5%</w:t>
             </w:r>
           </w:p>
         </w:tc>
@@ -2134,7 +2140,7 @@
                 <w:color w:val="000000"/>
                 <w:sz w:val="16"/>
               </w:rPr>
-              <w:t>+9.5</w:t>
+              <w:t>-8.5</w:t>
             </w:r>
           </w:p>
         </w:tc>
@@ -2162,7 +2168,7 @@
                 <w:color w:val="000000"/>
                 <w:sz w:val="16"/>
               </w:rPr>
-              <w:t>[-11.9, +31.6]</w:t>
+              <w:t>[-29.5, +12.6]</w:t>
             </w:r>
           </w:p>
         </w:tc>
@@ -2248,7 +2254,7 @@
                 <w:color w:val="000000"/>
                 <w:sz w:val="16"/>
               </w:rPr>
-              <w:t>5th Plymouth</w:t>
+              <w:t>20th Middlesex</w:t>
             </w:r>
           </w:p>
         </w:tc>
@@ -2275,7 +2281,7 @@
                 <w:color w:val="000000"/>
                 <w:sz w:val="16"/>
               </w:rPr>
-              <w:t>Lori Childs (D-Rockland)</w:t>
+              <w:t>Joseph Markey (D-Lynnfield)</w:t>
             </w:r>
           </w:p>
         </w:tc>
@@ -2302,13 +2308,7 @@
                 <w:color w:val="000000"/>
                 <w:sz w:val="16"/>
               </w:rPr>
-              <w:t>David F. DeCoste (R-Norwell)</w:t>
-            </w:r>
-            <w:r>
-              <w:rPr>
-                <w:vertAlign w:val="superscript"/>
-              </w:rPr>
-              <w:t>*</w:t>
+              <w:t>Trevor David Currier (R-Middleton)</w:t>
             </w:r>
           </w:p>
         </w:tc>
@@ -2335,7 +2335,7 @@
                 <w:color w:val="000000"/>
                 <w:sz w:val="16"/>
               </w:rPr>
-              <w:t>22.8%</w:t>
+              <w:t>76.6%</w:t>
             </w:r>
           </w:p>
         </w:tc>
@@ -2362,7 +2362,7 @@
                 <w:color w:val="000000"/>
                 <w:sz w:val="16"/>
               </w:rPr>
-              <w:t>-9.7</w:t>
+              <w:t>+9.1</w:t>
             </w:r>
           </w:p>
         </w:tc>
@@ -2389,7 +2389,7 @@
                 <w:color w:val="000000"/>
                 <w:sz w:val="16"/>
               </w:rPr>
-              <w:t>[-31.6, +12.3]</w:t>
+              <w:t>[-11.8, +29.7]</w:t>
             </w:r>
           </w:p>
         </w:tc>
@@ -2568,7 +2568,7 @@
                 <w:color w:val="000000"/>
                 <w:sz w:val="16"/>
               </w:rPr>
-              <w:t>82.2%</w:t>
+              <w:t>84.9%</w:t>
             </w:r>
           </w:p>
         </w:tc>
@@ -2596,7 +2596,7 @@
                 <w:color w:val="000000"/>
                 <w:sz w:val="16"/>
               </w:rPr>
-              <w:t>+12.3</w:t>
+              <w:t>+13.0</w:t>
             </w:r>
           </w:p>
         </w:tc>
@@ -2624,7 +2624,7 @@
                 <w:color w:val="000000"/>
                 <w:sz w:val="16"/>
               </w:rPr>
-              <w:t>[-9.4, +34.0]</w:t>
+              <w:t>[-8.1, +34.4]</w:t>
             </w:r>
           </w:p>
         </w:tc>
@@ -2683,7 +2683,7 @@
                 <w:color w:val="000000"/>
                 <w:sz w:val="16"/>
               </w:rPr>
-              <w:t>Senate</w:t>
+              <w:t>House</w:t>
             </w:r>
           </w:p>
         </w:tc>
@@ -2710,7 +2710,7 @@
                 <w:color w:val="000000"/>
                 <w:sz w:val="16"/>
               </w:rPr>
-              <w:t>Worcester &amp; Hampshire</w:t>
+              <w:t>5th Bristol</w:t>
             </w:r>
           </w:p>
         </w:tc>
@@ -2737,7 +2737,7 @@
                 <w:color w:val="000000"/>
                 <w:sz w:val="16"/>
               </w:rPr>
-              <w:t>Shannon M. Teabo (D-West Brookfield)</w:t>
+              <w:t>Jamison D. Souza (D-Somerset)</w:t>
             </w:r>
           </w:p>
         </w:tc>
@@ -2764,7 +2764,7 @@
                 <w:color w:val="000000"/>
                 <w:sz w:val="16"/>
               </w:rPr>
-              <w:t>Peter J. Durant (R-Spencer)</w:t>
+              <w:t>Justin E. Thurber (R-Somerset)</w:t>
             </w:r>
             <w:r>
               <w:rPr>
@@ -2797,7 +2797,7 @@
                 <w:color w:val="000000"/>
                 <w:sz w:val="16"/>
               </w:rPr>
-              <w:t>14.5%</w:t>
+              <w:t>13.8%</w:t>
             </w:r>
           </w:p>
         </w:tc>
@@ -2824,7 +2824,7 @@
                 <w:color w:val="000000"/>
                 <w:sz w:val="16"/>
               </w:rPr>
-              <w:t>-14.1</w:t>
+              <w:t>-13.9</w:t>
             </w:r>
           </w:p>
         </w:tc>
@@ -2851,7 +2851,7 @@
                 <w:color w:val="000000"/>
                 <w:sz w:val="16"/>
               </w:rPr>
-              <w:t>[-35.8, +7.8]</w:t>
+              <w:t>[-34.8, +7.6]</w:t>
             </w:r>
           </w:p>
         </w:tc>
@@ -2940,7 +2940,7 @@
                 <w:color w:val="000000"/>
                 <w:sz w:val="16"/>
               </w:rPr>
-              <w:t>5th Bristol</w:t>
+              <w:t>22nd Middlesex</w:t>
             </w:r>
           </w:p>
         </w:tc>
@@ -2968,7 +2968,7 @@
                 <w:color w:val="000000"/>
                 <w:sz w:val="16"/>
               </w:rPr>
-              <w:t>Jamison D. Souza (D-Somerset)</w:t>
+              <w:t>Daniel Ronald Darris-O'Connor (D-Billerica)</w:t>
             </w:r>
           </w:p>
         </w:tc>
@@ -2996,7 +2996,7 @@
                 <w:color w:val="000000"/>
                 <w:sz w:val="16"/>
               </w:rPr>
-              <w:t>Justin E. Thurber (R-Somerset)</w:t>
+              <w:t>Marc T. Lombardo (R-Billerica)</w:t>
             </w:r>
             <w:r>
               <w:rPr>
@@ -3030,7 +3030,7 @@
                 <w:color w:val="000000"/>
                 <w:sz w:val="16"/>
               </w:rPr>
-              <w:t>14.2%</w:t>
+              <w:t>13.5%</w:t>
             </w:r>
           </w:p>
         </w:tc>
@@ -3058,7 +3058,7 @@
                 <w:color w:val="000000"/>
                 <w:sz w:val="16"/>
               </w:rPr>
-              <w:t>-14.0</w:t>
+              <w:t>-14.1</w:t>
             </w:r>
           </w:p>
         </w:tc>
@@ -3086,7 +3086,7 @@
                 <w:color w:val="000000"/>
                 <w:sz w:val="16"/>
               </w:rPr>
-              <w:t>[-35.8, +7.3]</w:t>
+              <w:t>[-35.1, +7.1]</w:t>
             </w:r>
           </w:p>
         </w:tc>
@@ -3145,7 +3145,7 @@
                 <w:color w:val="000000"/>
                 <w:sz w:val="16"/>
               </w:rPr>
-              <w:t>House</w:t>
+              <w:t>Senate</w:t>
             </w:r>
           </w:p>
         </w:tc>
@@ -3172,7 +3172,7 @@
                 <w:color w:val="000000"/>
                 <w:sz w:val="16"/>
               </w:rPr>
-              <w:t>22nd Middlesex</w:t>
+              <w:t>Worcester &amp; Hampshire</w:t>
             </w:r>
           </w:p>
         </w:tc>
@@ -3199,7 +3199,7 @@
                 <w:color w:val="000000"/>
                 <w:sz w:val="16"/>
               </w:rPr>
-              <w:t>Daniel Ronald Darris-O'Connor (D-Billerica)</w:t>
+              <w:t>Shannon M. Teabo (D-West Brookfield)</w:t>
             </w:r>
           </w:p>
         </w:tc>
@@ -3226,7 +3226,7 @@
                 <w:color w:val="000000"/>
                 <w:sz w:val="16"/>
               </w:rPr>
-              <w:t>Marc T. Lombardo (R-Billerica)</w:t>
+              <w:t>Peter J. Durant (R-Spencer)</w:t>
             </w:r>
             <w:r>
               <w:rPr>
@@ -3259,7 +3259,7 @@
                 <w:color w:val="000000"/>
                 <w:sz w:val="16"/>
               </w:rPr>
-              <w:t>14.1%</w:t>
+              <w:t>13.1%</w:t>
             </w:r>
           </w:p>
         </w:tc>
@@ -3286,7 +3286,7 @@
                 <w:color w:val="000000"/>
                 <w:sz w:val="16"/>
               </w:rPr>
-              <w:t>-14.0</w:t>
+              <w:t>-14.7</w:t>
             </w:r>
           </w:p>
         </w:tc>
@@ -3313,7 +3313,7 @@
                 <w:color w:val="000000"/>
                 <w:sz w:val="16"/>
               </w:rPr>
-              <w:t>[-35.6, +7.4]</w:t>
+              <w:t>[-35.8, +6.9]</w:t>
             </w:r>
           </w:p>
         </w:tc>
@@ -3402,7 +3402,7 @@
                 <w:color w:val="000000"/>
                 <w:sz w:val="16"/>
               </w:rPr>
-              <w:t>7th Bristol</w:t>
+              <w:t>2nd Hampden</w:t>
             </w:r>
           </w:p>
         </w:tc>
@@ -3430,7 +3430,7 @@
                 <w:color w:val="000000"/>
                 <w:sz w:val="16"/>
               </w:rPr>
-              <w:t>Alan Silvia (D-Fall River)</w:t>
+              <w:t>Brian Michael Ashe (D-Longmeadow)</w:t>
             </w:r>
             <w:r>
               <w:rPr>
@@ -3464,7 +3464,7 @@
                 <w:color w:val="000000"/>
                 <w:sz w:val="16"/>
               </w:rPr>
-              <w:t>Talos D. Farris (R-Fall River)</w:t>
+              <w:t>Peter Warren (R-Monson)</w:t>
             </w:r>
           </w:p>
         </w:tc>
@@ -3492,7 +3492,7 @@
                 <w:color w:val="000000"/>
                 <w:sz w:val="16"/>
               </w:rPr>
-              <w:t>87.0%</w:t>
+              <w:t>88.8%</w:t>
             </w:r>
           </w:p>
         </w:tc>
@@ -3520,7 +3520,7 @@
                 <w:color w:val="000000"/>
                 <w:sz w:val="16"/>
               </w:rPr>
-              <w:t>+14.9</w:t>
+              <w:t>+15.7</w:t>
             </w:r>
           </w:p>
         </w:tc>
@@ -3548,7 +3548,7 @@
                 <w:color w:val="000000"/>
                 <w:sz w:val="16"/>
               </w:rPr>
-              <w:t>[-6.5, +37.2]</w:t>
+              <w:t>[-5.3, +37.0]</w:t>
             </w:r>
           </w:p>
         </w:tc>
@@ -3607,7 +3607,7 @@
                 <w:color w:val="000000"/>
                 <w:sz w:val="16"/>
               </w:rPr>
-              <w:t>Senate</w:t>
+              <w:t>House</w:t>
             </w:r>
           </w:p>
         </w:tc>
@@ -3634,7 +3634,7 @@
                 <w:color w:val="000000"/>
                 <w:sz w:val="16"/>
               </w:rPr>
-              <w:t>1st Bristol and Plymouth</w:t>
+              <w:t>7th Bristol</w:t>
             </w:r>
           </w:p>
         </w:tc>
@@ -3661,7 +3661,7 @@
                 <w:color w:val="000000"/>
                 <w:sz w:val="16"/>
               </w:rPr>
-              <w:t>Michael J. Rodrigues (D-Westport)</w:t>
+              <w:t>Alan Silvia (D-Fall River)</w:t>
             </w:r>
             <w:r>
               <w:rPr>
@@ -3694,7 +3694,7 @@
                 <w:color w:val="000000"/>
                 <w:sz w:val="16"/>
               </w:rPr>
-              <w:t>Gabriel Boomer Amaral (R-Fall River)</w:t>
+              <w:t>Talos D. Farris (R-Fall River)</w:t>
             </w:r>
           </w:p>
         </w:tc>
@@ -3721,7 +3721,7 @@
                 <w:color w:val="000000"/>
                 <w:sz w:val="16"/>
               </w:rPr>
-              <w:t>87.3%</w:t>
+              <w:t>88.9%</w:t>
             </w:r>
           </w:p>
         </w:tc>
@@ -3748,7 +3748,7 @@
                 <w:color w:val="000000"/>
                 <w:sz w:val="16"/>
               </w:rPr>
-              <w:t>+14.9</w:t>
+              <w:t>+15.6</w:t>
             </w:r>
           </w:p>
         </w:tc>
@@ -3775,7 +3775,7 @@
                 <w:color w:val="000000"/>
                 <w:sz w:val="16"/>
               </w:rPr>
-              <w:t>[-7.0, +36.5]</w:t>
+              <w:t>[-5.1, +36.6]</w:t>
             </w:r>
           </w:p>
         </w:tc>
@@ -3864,7 +3864,7 @@
                 <w:color w:val="000000"/>
                 <w:sz w:val="16"/>
               </w:rPr>
-              <w:t>2nd Hampden</w:t>
+              <w:t>2nd Plymouth</w:t>
             </w:r>
           </w:p>
         </w:tc>
@@ -3892,13 +3892,7 @@
                 <w:color w:val="000000"/>
                 <w:sz w:val="16"/>
               </w:rPr>
-              <w:t>Brian Michael Ashe (D-Longmeadow)</w:t>
-            </w:r>
-            <w:r>
-              <w:rPr>
-                <w:vertAlign w:val="superscript"/>
-              </w:rPr>
-              <w:t>*</w:t>
+              <w:t>Sarah G. Hewins (D-Carver)</w:t>
             </w:r>
           </w:p>
         </w:tc>
@@ -3926,7 +3920,13 @@
                 <w:color w:val="000000"/>
                 <w:sz w:val="16"/>
               </w:rPr>
-              <w:t>Peter Warren (R-Monson)</w:t>
+              <w:t>John Robert Gaskey (R-Carver)</w:t>
+            </w:r>
+            <w:r>
+              <w:rPr>
+                <w:vertAlign w:val="superscript"/>
+              </w:rPr>
+              <w:t>*</w:t>
             </w:r>
           </w:p>
         </w:tc>
@@ -3954,7 +3954,7 @@
                 <w:color w:val="000000"/>
                 <w:sz w:val="16"/>
               </w:rPr>
-              <w:t>87.6%</w:t>
+              <w:t>10.8%</w:t>
             </w:r>
           </w:p>
         </w:tc>
@@ -3982,7 +3982,7 @@
                 <w:color w:val="000000"/>
                 <w:sz w:val="16"/>
               </w:rPr>
-              <w:t>+15.5</w:t>
+              <w:t>-15.7</w:t>
             </w:r>
           </w:p>
         </w:tc>
@@ -4010,7 +4010,7 @@
                 <w:color w:val="000000"/>
                 <w:sz w:val="16"/>
               </w:rPr>
-              <w:t>[-6.4, +37.5]</w:t>
+              <w:t>[-36.4, +5.1]</w:t>
             </w:r>
           </w:p>
         </w:tc>
@@ -4183,7 +4183,7 @@
                 <w:color w:val="000000"/>
                 <w:sz w:val="16"/>
               </w:rPr>
-              <w:t>11.9%</w:t>
+              <w:t>10.7%</w:t>
             </w:r>
           </w:p>
         </w:tc>
@@ -4210,7 +4210,7 @@
                 <w:color w:val="000000"/>
                 <w:sz w:val="16"/>
               </w:rPr>
-              <w:t>-15.5</w:t>
+              <w:t>-16.1</w:t>
             </w:r>
           </w:p>
         </w:tc>
@@ -4237,7 +4237,7 @@
                 <w:color w:val="000000"/>
                 <w:sz w:val="16"/>
               </w:rPr>
-              <w:t>[-37.1, +5.8]</w:t>
+              <w:t>[-38.1, +5.0]</w:t>
             </w:r>
           </w:p>
         </w:tc>
@@ -4298,7 +4298,7 @@
                 <w:color w:val="000000"/>
                 <w:sz w:val="16"/>
               </w:rPr>
-              <w:t>Senate</w:t>
+              <w:t>House</w:t>
             </w:r>
           </w:p>
         </w:tc>
@@ -4326,7 +4326,7 @@
                 <w:color w:val="000000"/>
                 <w:sz w:val="16"/>
               </w:rPr>
-              <w:t>2nd Bristol and Plymouth</w:t>
+              <w:t>6th Bristol</w:t>
             </w:r>
           </w:p>
         </w:tc>
@@ -4354,7 +4354,7 @@
                 <w:color w:val="000000"/>
                 <w:sz w:val="16"/>
               </w:rPr>
-              <w:t>Mark C.W. Montigny (D-New Bedford)</w:t>
+              <w:t>Carole A. Fiola (D-Fall River)</w:t>
             </w:r>
             <w:r>
               <w:rPr>
@@ -4388,7 +4388,7 @@
                 <w:color w:val="000000"/>
                 <w:sz w:val="16"/>
               </w:rPr>
-              <w:t>Robert Scott McConnell (R-Fairhaven)</w:t>
+              <w:t>Robert G. Anctil (R-Freetown)</w:t>
             </w:r>
           </w:p>
         </w:tc>
@@ -4416,7 +4416,7 @@
                 <w:color w:val="000000"/>
                 <w:sz w:val="16"/>
               </w:rPr>
-              <w:t>88.4%</w:t>
+              <w:t>89.7%</w:t>
             </w:r>
           </w:p>
         </w:tc>
@@ -4444,7 +4444,7 @@
                 <w:color w:val="000000"/>
                 <w:sz w:val="16"/>
               </w:rPr>
-              <w:t>+16.1</w:t>
+              <w:t>+16.4</w:t>
             </w:r>
           </w:p>
         </w:tc>
@@ -4472,7 +4472,7 @@
                 <w:color w:val="000000"/>
                 <w:sz w:val="16"/>
               </w:rPr>
-              <w:t>[-6.0, +38.1]</w:t>
+              <w:t>[-5.1, +37.6]</w:t>
             </w:r>
           </w:p>
         </w:tc>
@@ -4531,7 +4531,7 @@
                 <w:color w:val="000000"/>
                 <w:sz w:val="16"/>
               </w:rPr>
-              <w:t>House</w:t>
+              <w:t>Senate</w:t>
             </w:r>
           </w:p>
         </w:tc>
@@ -4558,7 +4558,7 @@
                 <w:color w:val="000000"/>
                 <w:sz w:val="16"/>
               </w:rPr>
-              <w:t>6th Bristol</w:t>
+              <w:t>2nd Bristol and Plymouth</w:t>
             </w:r>
           </w:p>
         </w:tc>
@@ -4585,7 +4585,7 @@
                 <w:color w:val="000000"/>
                 <w:sz w:val="16"/>
               </w:rPr>
-              <w:t>Carole A. Fiola (D-Fall River)</w:t>
+              <w:t>Mark C.W. Montigny (D-New Bedford)</w:t>
             </w:r>
             <w:r>
               <w:rPr>
@@ -4618,7 +4618,7 @@
                 <w:color w:val="000000"/>
                 <w:sz w:val="16"/>
               </w:rPr>
-              <w:t>Robert G. Anctil (R-Freetown)</w:t>
+              <w:t>Robert Scott McConnell (R-Fairhaven)</w:t>
             </w:r>
           </w:p>
         </w:tc>
@@ -4645,7 +4645,7 @@
                 <w:color w:val="000000"/>
                 <w:sz w:val="16"/>
               </w:rPr>
-              <w:t>88.6%</w:t>
+              <w:t>90.0%</w:t>
             </w:r>
           </w:p>
         </w:tc>
@@ -4672,7 +4672,7 @@
                 <w:color w:val="000000"/>
                 <w:sz w:val="16"/>
               </w:rPr>
-              <w:t>+16.0</w:t>
+              <w:t>+16.5</w:t>
             </w:r>
           </w:p>
         </w:tc>
@@ -4699,7 +4699,7 @@
                 <w:color w:val="000000"/>
                 <w:sz w:val="16"/>
               </w:rPr>
-              <w:t>[-6.1, +37.9]</w:t>
+              <w:t>[-4.6, +37.6]</w:t>
             </w:r>
           </w:p>
         </w:tc>
@@ -4788,7 +4788,7 @@
                 <w:color w:val="000000"/>
                 <w:sz w:val="16"/>
               </w:rPr>
-              <w:t>2nd Plymouth</w:t>
+              <w:t>3rd Bristol</w:t>
             </w:r>
           </w:p>
         </w:tc>
@@ -4816,7 +4816,13 @@
                 <w:color w:val="000000"/>
                 <w:sz w:val="16"/>
               </w:rPr>
-              <w:t>Sarah G. Hewins (D-Carver)</w:t>
+              <w:t>Lisa M. Field (D-Taunton)</w:t>
+            </w:r>
+            <w:r>
+              <w:rPr>
+                <w:vertAlign w:val="superscript"/>
+              </w:rPr>
+              <w:t>*</w:t>
             </w:r>
           </w:p>
         </w:tc>
@@ -4844,13 +4850,7 @@
                 <w:color w:val="000000"/>
                 <w:sz w:val="16"/>
               </w:rPr>
-              <w:t>John Robert Gaskey (R-Carver)</w:t>
-            </w:r>
-            <w:r>
-              <w:rPr>
-                <w:vertAlign w:val="superscript"/>
-              </w:rPr>
-              <w:t>*</w:t>
+              <w:t>Lawrence Joseph Quintal (R-Taunton)</w:t>
             </w:r>
           </w:p>
         </w:tc>
@@ -4878,7 +4878,7 @@
                 <w:color w:val="000000"/>
                 <w:sz w:val="16"/>
               </w:rPr>
-              <w:t>9.2%</w:t>
+              <w:t>91.4%</w:t>
             </w:r>
           </w:p>
         </w:tc>
@@ -4906,7 +4906,7 @@
                 <w:color w:val="000000"/>
                 <w:sz w:val="16"/>
               </w:rPr>
-              <w:t>-17.6</w:t>
+              <w:t>+17.2</w:t>
             </w:r>
           </w:p>
         </w:tc>
@@ -4934,7 +4934,7 @@
                 <w:color w:val="000000"/>
                 <w:sz w:val="16"/>
               </w:rPr>
-              <w:t>[-39.7, +3.9]</w:t>
+              <w:t>[-3.5, +37.8]</w:t>
             </w:r>
           </w:p>
         </w:tc>
@@ -5020,7 +5020,7 @@
                 <w:color w:val="000000"/>
                 <w:sz w:val="16"/>
               </w:rPr>
-              <w:t>15th Essex</w:t>
+              <w:t>18th Essex</w:t>
             </w:r>
           </w:p>
         </w:tc>
@@ -5047,13 +5047,7 @@
                 <w:color w:val="000000"/>
                 <w:sz w:val="16"/>
               </w:rPr>
-              <w:t>Ryan M. Hamilton (D-Methuen)</w:t>
-            </w:r>
-            <w:r>
-              <w:rPr>
-                <w:vertAlign w:val="superscript"/>
-              </w:rPr>
-              <w:t>*</w:t>
+              <w:t>Connor A. Murray (D-Andover)</w:t>
             </w:r>
           </w:p>
         </w:tc>
@@ -5080,7 +5074,7 @@
                 <w:color w:val="000000"/>
                 <w:sz w:val="16"/>
               </w:rPr>
-              <w:t>Ronald L. Heiseler, III (R-Haverhill)</w:t>
+              <w:t>Christopher C. Shepley (R-Andover)</w:t>
             </w:r>
           </w:p>
         </w:tc>
@@ -5107,7 +5101,7 @@
                 <w:color w:val="000000"/>
                 <w:sz w:val="16"/>
               </w:rPr>
-              <w:t>90.9%</w:t>
+              <w:t>92.6%</w:t>
             </w:r>
           </w:p>
         </w:tc>
@@ -5134,7 +5128,7 @@
                 <w:color w:val="000000"/>
                 <w:sz w:val="16"/>
               </w:rPr>
-              <w:t>+17.6</w:t>
+              <w:t>+18.7</w:t>
             </w:r>
           </w:p>
         </w:tc>
@@ -5161,7 +5155,7 @@
                 <w:color w:val="000000"/>
                 <w:sz w:val="16"/>
               </w:rPr>
-              <w:t>[-4.0, +38.5]</w:t>
+              <w:t>[-2.6, +39.9]</w:t>
             </w:r>
           </w:p>
         </w:tc>
@@ -5250,7 +5244,7 @@
                 <w:color w:val="000000"/>
                 <w:sz w:val="16"/>
               </w:rPr>
-              <w:t>3rd Bristol</w:t>
+              <w:t>9th Plymouth</w:t>
             </w:r>
           </w:p>
         </w:tc>
@@ -5278,7 +5272,7 @@
                 <w:color w:val="000000"/>
                 <w:sz w:val="16"/>
               </w:rPr>
-              <w:t>Lisa M. Field (D-Taunton)</w:t>
+              <w:t>Bridget Marie Plouffe (D-Brockton)</w:t>
             </w:r>
             <w:r>
               <w:rPr>
@@ -5312,7 +5306,7 @@
                 <w:color w:val="000000"/>
                 <w:sz w:val="16"/>
               </w:rPr>
-              <w:t>Lawrence Joseph Quintal (R-Taunton)</w:t>
+              <w:t>Lawrence Peter Novak (R-Brockton)</w:t>
             </w:r>
           </w:p>
         </w:tc>
@@ -5340,7 +5334,7 @@
                 <w:color w:val="000000"/>
                 <w:sz w:val="16"/>
               </w:rPr>
-              <w:t>91.9%</w:t>
+              <w:t>92.9%</w:t>
             </w:r>
           </w:p>
         </w:tc>
@@ -5368,7 +5362,7 @@
                 <w:color w:val="000000"/>
                 <w:sz w:val="16"/>
               </w:rPr>
-              <w:t>+18.3</w:t>
+              <w:t>+18.9</w:t>
             </w:r>
           </w:p>
         </w:tc>
@@ -5396,7 +5390,7 @@
                 <w:color w:val="000000"/>
                 <w:sz w:val="16"/>
               </w:rPr>
-              <w:t>[-3.0, +39.6]</w:t>
+              <w:t>[-2.3, +40.2]</w:t>
             </w:r>
           </w:p>
         </w:tc>
@@ -5569,7 +5563,7 @@
                 <w:color w:val="000000"/>
                 <w:sz w:val="16"/>
               </w:rPr>
-              <w:t>7.9%</w:t>
+              <w:t>7.0%</w:t>
             </w:r>
           </w:p>
         </w:tc>
@@ -5596,7 +5590,7 @@
                 <w:color w:val="000000"/>
                 <w:sz w:val="16"/>
               </w:rPr>
-              <w:t>-18.4</w:t>
+              <w:t>-18.8</w:t>
             </w:r>
           </w:p>
         </w:tc>
@@ -5623,7 +5617,7 @@
                 <w:color w:val="000000"/>
                 <w:sz w:val="16"/>
               </w:rPr>
-              <w:t>[-40.0, +3.2]</w:t>
+              <w:t>[-39.6, +2.0]</w:t>
             </w:r>
           </w:p>
         </w:tc>
@@ -5712,7 +5706,7 @@
                 <w:color w:val="000000"/>
                 <w:sz w:val="16"/>
               </w:rPr>
-              <w:t>4th Hampden</w:t>
+              <w:t>15th Essex</w:t>
             </w:r>
           </w:p>
         </w:tc>
@@ -5740,7 +5734,13 @@
                 <w:color w:val="000000"/>
                 <w:sz w:val="16"/>
               </w:rPr>
-              <w:t>Colby Walshe Hoffman (D-Westfield)</w:t>
+              <w:t>Ryan M. Hamilton (D-Methuen)</w:t>
+            </w:r>
+            <w:r>
+              <w:rPr>
+                <w:vertAlign w:val="superscript"/>
+              </w:rPr>
+              <w:t>*</w:t>
             </w:r>
           </w:p>
         </w:tc>
@@ -5768,13 +5768,7 @@
                 <w:color w:val="000000"/>
                 <w:sz w:val="16"/>
               </w:rPr>
-              <w:t>Kelly W. Pease (R-Westfield)</w:t>
-            </w:r>
-            <w:r>
-              <w:rPr>
-                <w:vertAlign w:val="superscript"/>
-              </w:rPr>
-              <w:t>*</w:t>
+              <w:t>Ronald L. Heiseler, III (R-Haverhill)</w:t>
             </w:r>
           </w:p>
         </w:tc>
@@ -5802,7 +5796,7 @@
                 <w:color w:val="000000"/>
                 <w:sz w:val="16"/>
               </w:rPr>
-              <w:t>7.6%</w:t>
+              <w:t>93.1%</w:t>
             </w:r>
           </w:p>
         </w:tc>
@@ -5830,7 +5824,7 @@
                 <w:color w:val="000000"/>
                 <w:sz w:val="16"/>
               </w:rPr>
-              <w:t>-18.3</w:t>
+              <w:t>+19.1</w:t>
             </w:r>
           </w:p>
         </w:tc>
@@ -5858,7 +5852,7 @@
                 <w:color w:val="000000"/>
                 <w:sz w:val="16"/>
               </w:rPr>
-              <w:t>[-39.5, +3.0]</w:t>
+              <w:t>[-2.3, +40.6]</w:t>
             </w:r>
           </w:p>
         </w:tc>
@@ -5944,7 +5938,7 @@
                 <w:color w:val="000000"/>
                 <w:sz w:val="16"/>
               </w:rPr>
-              <w:t>9th Plymouth</w:t>
+              <w:t>4th Hampden</w:t>
             </w:r>
           </w:p>
         </w:tc>
@@ -5971,7 +5965,34 @@
                 <w:color w:val="000000"/>
                 <w:sz w:val="16"/>
               </w:rPr>
-              <w:t>Bridget Marie Plouffe (D-Brockton)</w:t>
+              <w:t>Colby Walshe Hoffman (D-Westfield)</w:t>
+            </w:r>
+          </w:p>
+        </w:tc>
+        <w:tc>
+          <w:tcPr>
+            <w:tcW w:type="dxa" w:w="2376"/>
+            <w:vAlign w:val="center"/>
+            <w:tcMar>
+              <w:top w:w="70" w:type="dxa"/>
+              <w:start w:w="65" w:type="dxa"/>
+              <w:bottom w:w="70" w:type="dxa"/>
+              <w:end w:w="65" w:type="dxa"/>
+            </w:tcMar>
+          </w:tcPr>
+          <w:p>
+            <w:pPr>
+              <w:spacing w:after="0" w:line="240" w:lineRule="auto"/>
+              <w:jc w:val="left"/>
+            </w:pPr>
+            <w:r>
+              <w:rPr>
+                <w:rFonts w:ascii="Arial" w:hAnsi="Arial"/>
+                <w:b w:val="0"/>
+                <w:color w:val="000000"/>
+                <w:sz w:val="16"/>
+              </w:rPr>
+              <w:t>Kelly W. Pease (R-Westfield)</w:t>
             </w:r>
             <w:r>
               <w:rPr>
@@ -5983,33 +6004,6 @@
         </w:tc>
         <w:tc>
           <w:tcPr>
-            <w:tcW w:type="dxa" w:w="2376"/>
-            <w:vAlign w:val="center"/>
-            <w:tcMar>
-              <w:top w:w="70" w:type="dxa"/>
-              <w:start w:w="65" w:type="dxa"/>
-              <w:bottom w:w="70" w:type="dxa"/>
-              <w:end w:w="65" w:type="dxa"/>
-            </w:tcMar>
-          </w:tcPr>
-          <w:p>
-            <w:pPr>
-              <w:spacing w:after="0" w:line="240" w:lineRule="auto"/>
-              <w:jc w:val="left"/>
-            </w:pPr>
-            <w:r>
-              <w:rPr>
-                <w:rFonts w:ascii="Arial" w:hAnsi="Arial"/>
-                <w:b w:val="0"/>
-                <w:color w:val="000000"/>
-                <w:sz w:val="16"/>
-              </w:rPr>
-              <w:t>Lawrence Peter Novak (R-Brockton)</w:t>
-            </w:r>
-          </w:p>
-        </w:tc>
-        <w:tc>
-          <w:tcPr>
             <w:tcW w:type="dxa" w:w="893"/>
             <w:vAlign w:val="center"/>
             <w:tcMar>
@@ -6031,7 +6025,7 @@
                 <w:color w:val="000000"/>
                 <w:sz w:val="16"/>
               </w:rPr>
-              <w:t>93.0%</w:t>
+              <w:t>6.8%</w:t>
             </w:r>
           </w:p>
         </w:tc>
@@ -6058,7 +6052,7 @@
                 <w:color w:val="000000"/>
                 <w:sz w:val="16"/>
               </w:rPr>
-              <w:t>+19.3</w:t>
+              <w:t>-19.5</w:t>
             </w:r>
           </w:p>
         </w:tc>
@@ -6085,7 +6079,7 @@
                 <w:color w:val="000000"/>
                 <w:sz w:val="16"/>
               </w:rPr>
-              <w:t>[-2.1, +40.8]</w:t>
+              <w:t>[-40.5, +2.0]</w:t>
             </w:r>
           </w:p>
         </w:tc>
@@ -6146,7 +6140,7 @@
                 <w:color w:val="000000"/>
                 <w:sz w:val="16"/>
               </w:rPr>
-              <w:t>House</w:t>
+              <w:t>Senate</w:t>
             </w:r>
           </w:p>
         </w:tc>
@@ -6174,7 +6168,7 @@
                 <w:color w:val="000000"/>
                 <w:sz w:val="16"/>
               </w:rPr>
-              <w:t>18th Essex</w:t>
+              <w:t>1st Bristol and Plymouth</w:t>
             </w:r>
           </w:p>
         </w:tc>
@@ -6202,7 +6196,13 @@
                 <w:color w:val="000000"/>
                 <w:sz w:val="16"/>
               </w:rPr>
-              <w:t>Connor A. Murray (D-Andover)</w:t>
+              <w:t>Michael J. Rodrigues (D-Westport)</w:t>
+            </w:r>
+            <w:r>
+              <w:rPr>
+                <w:vertAlign w:val="superscript"/>
+              </w:rPr>
+              <w:t>*</w:t>
             </w:r>
           </w:p>
         </w:tc>
@@ -6230,7 +6230,7 @@
                 <w:color w:val="000000"/>
                 <w:sz w:val="16"/>
               </w:rPr>
-              <w:t>Christopher C. Shepley (R-Andover)</w:t>
+              <w:t>Gabriel Boomer Amaral (R-Fall River)</w:t>
             </w:r>
           </w:p>
         </w:tc>
@@ -6258,7 +6258,7 @@
                 <w:color w:val="000000"/>
                 <w:sz w:val="16"/>
               </w:rPr>
-              <w:t>93.3%</w:t>
+              <w:t>94.6%</w:t>
             </w:r>
           </w:p>
         </w:tc>
@@ -6286,7 +6286,7 @@
                 <w:color w:val="000000"/>
                 <w:sz w:val="16"/>
               </w:rPr>
-              <w:t>+19.2</w:t>
+              <w:t>+20.1</w:t>
             </w:r>
           </w:p>
         </w:tc>
@@ -6314,7 +6314,7 @@
                 <w:color w:val="000000"/>
                 <w:sz w:val="16"/>
               </w:rPr>
-              <w:t>[-2.0, +40.9]</w:t>
+              <w:t>[-0.5, +41.5]</w:t>
             </w:r>
           </w:p>
         </w:tc>
@@ -6400,7 +6400,7 @@
                 <w:color w:val="000000"/>
                 <w:sz w:val="16"/>
               </w:rPr>
-              <w:t>12th Plymouth</w:t>
+              <w:t>1st Middlesex</w:t>
             </w:r>
           </w:p>
         </w:tc>
@@ -6427,7 +6427,7 @@
                 <w:color w:val="000000"/>
                 <w:sz w:val="16"/>
               </w:rPr>
-              <w:t>Kathleen LaNatra (D-Kingston)</w:t>
+              <w:t>Margaret R. Scarsdale (D-Pepperell)</w:t>
             </w:r>
             <w:r>
               <w:rPr>
@@ -6460,7 +6460,7 @@
                 <w:color w:val="000000"/>
                 <w:sz w:val="16"/>
               </w:rPr>
-              <w:t>Eric J. Meschino (R-Plymouth)</w:t>
+              <w:t>Christopher M. Lyons (R-Ashby)</w:t>
             </w:r>
           </w:p>
         </w:tc>
@@ -6487,7 +6487,7 @@
                 <w:color w:val="000000"/>
                 <w:sz w:val="16"/>
               </w:rPr>
-              <w:t>94.3%</w:t>
+              <w:t>96.1%</w:t>
             </w:r>
           </w:p>
         </w:tc>
@@ -6514,7 +6514,7 @@
                 <w:color w:val="000000"/>
                 <w:sz w:val="16"/>
               </w:rPr>
-              <w:t>+20.9</w:t>
+              <w:t>+22.3</w:t>
             </w:r>
           </w:p>
         </w:tc>
@@ -6541,7 +6541,7 @@
                 <w:color w:val="000000"/>
                 <w:sz w:val="16"/>
               </w:rPr>
-              <w:t>[-1.1, +42.4]</w:t>
+              <w:t>[+1.6, +43.3]</w:t>
             </w:r>
           </w:p>
         </w:tc>
@@ -6630,7 +6630,7 @@
                 <w:color w:val="000000"/>
                 <w:sz w:val="16"/>
               </w:rPr>
-              <w:t>1st Middlesex</w:t>
+              <w:t>12th Worcester</w:t>
             </w:r>
           </w:p>
         </w:tc>
@@ -6658,7 +6658,7 @@
                 <w:color w:val="000000"/>
                 <w:sz w:val="16"/>
               </w:rPr>
-              <w:t>Margaret R. Scarsdale (D-Pepperell)</w:t>
+              <w:t>Meghan Kilcoyne (D-Clinton)</w:t>
             </w:r>
             <w:r>
               <w:rPr>
@@ -6692,7 +6692,7 @@
                 <w:color w:val="000000"/>
                 <w:sz w:val="16"/>
               </w:rPr>
-              <w:t>Christopher M. Lyons (R-Ashby)</w:t>
+              <w:t>Lisa K. Mair (R-Berlin)</w:t>
             </w:r>
           </w:p>
         </w:tc>
@@ -6720,7 +6720,7 @@
                 <w:color w:val="000000"/>
                 <w:sz w:val="16"/>
               </w:rPr>
-              <w:t>94.4%</w:t>
+              <w:t>96.3%</w:t>
             </w:r>
           </w:p>
         </w:tc>
@@ -6748,7 +6748,7 @@
                 <w:color w:val="000000"/>
                 <w:sz w:val="16"/>
               </w:rPr>
-              <w:t>+21.0</w:t>
+              <w:t>+22.4</w:t>
             </w:r>
           </w:p>
         </w:tc>
@@ -6776,7 +6776,7 @@
                 <w:color w:val="000000"/>
                 <w:sz w:val="16"/>
               </w:rPr>
-              <w:t>[-0.7, +42.4]</w:t>
+              <w:t>[+2.0, +43.2]</w:t>
             </w:r>
           </w:p>
         </w:tc>
@@ -6862,7 +6862,7 @@
                 <w:color w:val="000000"/>
                 <w:sz w:val="16"/>
               </w:rPr>
-              <w:t>18th Worcester</w:t>
+              <w:t>12th Plymouth</w:t>
             </w:r>
           </w:p>
         </w:tc>
@@ -6889,7 +6889,13 @@
                 <w:color w:val="000000"/>
                 <w:sz w:val="16"/>
               </w:rPr>
-              <w:t>Jenifer Heck (D-Sutton)</w:t>
+              <w:t>Kathleen LaNatra (D-Kingston)</w:t>
+            </w:r>
+            <w:r>
+              <w:rPr>
+                <w:vertAlign w:val="superscript"/>
+              </w:rPr>
+              <w:t>*</w:t>
             </w:r>
           </w:p>
         </w:tc>
@@ -6916,13 +6922,7 @@
                 <w:color w:val="000000"/>
                 <w:sz w:val="16"/>
               </w:rPr>
-              <w:t>Joseph D. McKenna (R-Sutton)</w:t>
-            </w:r>
-            <w:r>
-              <w:rPr>
-                <w:vertAlign w:val="superscript"/>
-              </w:rPr>
-              <w:t>*</w:t>
+              <w:t>Eric J. Meschino (R-Plymouth)</w:t>
             </w:r>
           </w:p>
         </w:tc>
@@ -6949,7 +6949,7 @@
                 <w:color w:val="000000"/>
                 <w:sz w:val="16"/>
               </w:rPr>
-              <w:t>3.9%</w:t>
+              <w:t>96.4%</w:t>
             </w:r>
           </w:p>
         </w:tc>
@@ -6976,7 +6976,7 @@
                 <w:color w:val="000000"/>
                 <w:sz w:val="16"/>
               </w:rPr>
-              <w:t>-23.3</w:t>
+              <w:t>+22.6</w:t>
             </w:r>
           </w:p>
         </w:tc>
@@ -7003,7 +7003,7 @@
                 <w:color w:val="000000"/>
                 <w:sz w:val="16"/>
               </w:rPr>
-              <w:t>[-45.0, -1.6]</w:t>
+              <w:t>[+1.9, +43.6]</w:t>
             </w:r>
           </w:p>
         </w:tc>
@@ -7092,7 +7092,7 @@
                 <w:color w:val="000000"/>
                 <w:sz w:val="16"/>
               </w:rPr>
-              <w:t>1st Plymouth</w:t>
+              <w:t>3rd Hampden</w:t>
             </w:r>
           </w:p>
         </w:tc>
@@ -7120,13 +7120,7 @@
                 <w:color w:val="000000"/>
                 <w:sz w:val="16"/>
               </w:rPr>
-              <w:t>Michelle L. Badger (D-Plymouth)</w:t>
-            </w:r>
-            <w:r>
-              <w:rPr>
-                <w:vertAlign w:val="superscript"/>
-              </w:rPr>
-              <w:t>*</w:t>
+              <w:t>Thomas D. Hendrickson (D-Agawam)</w:t>
             </w:r>
           </w:p>
         </w:tc>
@@ -7154,7 +7148,13 @@
                 <w:color w:val="000000"/>
                 <w:sz w:val="16"/>
               </w:rPr>
-              <w:t>David Michael Golden, Jr. (R-Plymouth)</w:t>
+              <w:t>Nicholas A. Boldyga (R-Southwick)</w:t>
+            </w:r>
+            <w:r>
+              <w:rPr>
+                <w:vertAlign w:val="superscript"/>
+              </w:rPr>
+              <w:t>*</w:t>
             </w:r>
           </w:p>
         </w:tc>
@@ -7182,7 +7182,7 @@
                 <w:color w:val="000000"/>
                 <w:sz w:val="16"/>
               </w:rPr>
-              <w:t>96.1%</w:t>
+              <w:t>3.3%</w:t>
             </w:r>
           </w:p>
         </w:tc>
@@ -7210,7 +7210,7 @@
                 <w:color w:val="000000"/>
                 <w:sz w:val="16"/>
               </w:rPr>
-              <w:t>+23.0</w:t>
+              <w:t>-23.4</w:t>
             </w:r>
           </w:p>
         </w:tc>
@@ -7238,7 +7238,7 @@
                 <w:color w:val="000000"/>
                 <w:sz w:val="16"/>
               </w:rPr>
-              <w:t>[+1.5, +44.5]</w:t>
+              <w:t>[-44.8, -2.7]</w:t>
             </w:r>
           </w:p>
         </w:tc>
@@ -7297,7 +7297,7 @@
                 <w:color w:val="000000"/>
                 <w:sz w:val="16"/>
               </w:rPr>
-              <w:t>Senate</w:t>
+              <w:t>House</w:t>
             </w:r>
           </w:p>
         </w:tc>
@@ -7324,7 +7324,7 @@
                 <w:color w:val="000000"/>
                 <w:sz w:val="16"/>
               </w:rPr>
-              <w:t>1st Middlesex</w:t>
+              <w:t>18th Worcester</w:t>
             </w:r>
           </w:p>
         </w:tc>
@@ -7351,7 +7351,34 @@
                 <w:color w:val="000000"/>
                 <w:sz w:val="16"/>
               </w:rPr>
-              <w:t>Vanna Howard (D-Lowell)</w:t>
+              <w:t>Jenifer Heck (D-Sutton)</w:t>
+            </w:r>
+          </w:p>
+        </w:tc>
+        <w:tc>
+          <w:tcPr>
+            <w:tcW w:type="dxa" w:w="2376"/>
+            <w:vAlign w:val="center"/>
+            <w:tcMar>
+              <w:top w:w="70" w:type="dxa"/>
+              <w:start w:w="65" w:type="dxa"/>
+              <w:bottom w:w="70" w:type="dxa"/>
+              <w:end w:w="65" w:type="dxa"/>
+            </w:tcMar>
+          </w:tcPr>
+          <w:p>
+            <w:pPr>
+              <w:spacing w:after="0" w:line="240" w:lineRule="auto"/>
+              <w:jc w:val="left"/>
+            </w:pPr>
+            <w:r>
+              <w:rPr>
+                <w:rFonts w:ascii="Arial" w:hAnsi="Arial"/>
+                <w:b w:val="0"/>
+                <w:color w:val="000000"/>
+                <w:sz w:val="16"/>
+              </w:rPr>
+              <w:t>Joseph D. McKenna (R-Sutton)</w:t>
             </w:r>
             <w:r>
               <w:rPr>
@@ -7363,33 +7390,6 @@
         </w:tc>
         <w:tc>
           <w:tcPr>
-            <w:tcW w:type="dxa" w:w="2376"/>
-            <w:vAlign w:val="center"/>
-            <w:tcMar>
-              <w:top w:w="70" w:type="dxa"/>
-              <w:start w:w="65" w:type="dxa"/>
-              <w:bottom w:w="70" w:type="dxa"/>
-              <w:end w:w="65" w:type="dxa"/>
-            </w:tcMar>
-          </w:tcPr>
-          <w:p>
-            <w:pPr>
-              <w:spacing w:after="0" w:line="240" w:lineRule="auto"/>
-              <w:jc w:val="left"/>
-            </w:pPr>
-            <w:r>
-              <w:rPr>
-                <w:rFonts w:ascii="Arial" w:hAnsi="Arial"/>
-                <w:b w:val="0"/>
-                <w:color w:val="000000"/>
-                <w:sz w:val="16"/>
-              </w:rPr>
-              <w:t>Sam Meas (R-Lowell)</w:t>
-            </w:r>
-          </w:p>
-        </w:tc>
-        <w:tc>
-          <w:tcPr>
             <w:tcW w:type="dxa" w:w="893"/>
             <w:vAlign w:val="center"/>
             <w:tcMar>
@@ -7411,7 +7411,7 @@
                 <w:color w:val="000000"/>
                 <w:sz w:val="16"/>
               </w:rPr>
-              <w:t>96.9%</w:t>
+              <w:t>3.0%</w:t>
             </w:r>
           </w:p>
         </w:tc>
@@ -7438,7 +7438,7 @@
                 <w:color w:val="000000"/>
                 <w:sz w:val="16"/>
               </w:rPr>
-              <w:t>+24.9</w:t>
+              <w:t>-23.7</w:t>
             </w:r>
           </w:p>
         </w:tc>
@@ -7465,7 +7465,7 @@
                 <w:color w:val="000000"/>
                 <w:sz w:val="16"/>
               </w:rPr>
-              <w:t>[+3.1, +46.1]</w:t>
+              <w:t>[-45.0, -2.6]</w:t>
             </w:r>
           </w:p>
         </w:tc>
@@ -7554,7 +7554,7 @@
                 <w:color w:val="000000"/>
                 <w:sz w:val="16"/>
               </w:rPr>
-              <w:t>3rd Hampden</w:t>
+              <w:t>1st Plymouth</w:t>
             </w:r>
           </w:p>
         </w:tc>
@@ -7582,7 +7582,13 @@
                 <w:color w:val="000000"/>
                 <w:sz w:val="16"/>
               </w:rPr>
-              <w:t>Thomas D. Hendrickson (D-Agawam)</w:t>
+              <w:t>Michelle L. Badger (D-Plymouth)</w:t>
+            </w:r>
+            <w:r>
+              <w:rPr>
+                <w:vertAlign w:val="superscript"/>
+              </w:rPr>
+              <w:t>*</w:t>
             </w:r>
           </w:p>
         </w:tc>
@@ -7610,13 +7616,7 @@
                 <w:color w:val="000000"/>
                 <w:sz w:val="16"/>
               </w:rPr>
-              <w:t>Nicholas A. Boldyga (R-Southwick)</w:t>
-            </w:r>
-            <w:r>
-              <w:rPr>
-                <w:vertAlign w:val="superscript"/>
-              </w:rPr>
-              <w:t>*</w:t>
+              <w:t>David Michael Golden, Jr. (R-Plymouth)</w:t>
             </w:r>
           </w:p>
         </w:tc>
@@ -7644,7 +7644,7 @@
                 <w:color w:val="000000"/>
                 <w:sz w:val="16"/>
               </w:rPr>
-              <w:t>2.9%</w:t>
+              <w:t>97.0%</w:t>
             </w:r>
           </w:p>
         </w:tc>
@@ -7672,7 +7672,7 @@
                 <w:color w:val="000000"/>
                 <w:sz w:val="16"/>
               </w:rPr>
-              <w:t>-25.3</w:t>
+              <w:t>+24.1</w:t>
             </w:r>
           </w:p>
         </w:tc>
@@ -7700,7 +7700,7 @@
                 <w:color w:val="000000"/>
                 <w:sz w:val="16"/>
               </w:rPr>
-              <w:t>[-46.9, -3.5]</w:t>
+              <w:t>[+2.9, +44.8]</w:t>
             </w:r>
           </w:p>
         </w:tc>
@@ -7786,7 +7786,7 @@
                 <w:color w:val="000000"/>
                 <w:sz w:val="16"/>
               </w:rPr>
-              <w:t>6th Worcester</w:t>
+              <w:t>2nd Essex</w:t>
             </w:r>
           </w:p>
         </w:tc>
@@ -7813,7 +7813,13 @@
                 <w:color w:val="000000"/>
                 <w:sz w:val="16"/>
               </w:rPr>
-              <w:t>Jeanne Renaud Costello (D-Charlton)</w:t>
+              <w:t>Kristin Elena Kassner (D-Hamilton)</w:t>
+            </w:r>
+            <w:r>
+              <w:rPr>
+                <w:vertAlign w:val="superscript"/>
+              </w:rPr>
+              <w:t>*</w:t>
             </w:r>
           </w:p>
         </w:tc>
@@ -7840,13 +7846,7 @@
                 <w:color w:val="000000"/>
                 <w:sz w:val="16"/>
               </w:rPr>
-              <w:t>John J. Marsi, Jr. (R-Charlton)</w:t>
-            </w:r>
-            <w:r>
-              <w:rPr>
-                <w:vertAlign w:val="superscript"/>
-              </w:rPr>
-              <w:t>*</w:t>
+              <w:t>Daniel James Kelly (R-Ipswich)</w:t>
             </w:r>
           </w:p>
         </w:tc>
@@ -7873,7 +7873,7 @@
                 <w:color w:val="000000"/>
                 <w:sz w:val="16"/>
               </w:rPr>
-              <w:t>2.8%</w:t>
+              <w:t>97.1%</w:t>
             </w:r>
           </w:p>
         </w:tc>
@@ -7900,7 +7900,7 @@
                 <w:color w:val="000000"/>
                 <w:sz w:val="16"/>
               </w:rPr>
-              <w:t>-24.8</w:t>
+              <w:t>+23.9</w:t>
             </w:r>
           </w:p>
         </w:tc>
@@ -7927,7 +7927,7 @@
                 <w:color w:val="000000"/>
                 <w:sz w:val="16"/>
               </w:rPr>
-              <w:t>[-46.7, -3.2]</w:t>
+              <w:t>[+3.1, +44.9]</w:t>
             </w:r>
           </w:p>
         </w:tc>
@@ -8016,7 +8016,7 @@
                 <w:color w:val="000000"/>
                 <w:sz w:val="16"/>
               </w:rPr>
-              <w:t>12th Worcester</w:t>
+              <w:t>10th Bristol</w:t>
             </w:r>
           </w:p>
         </w:tc>
@@ -8044,7 +8044,7 @@
                 <w:color w:val="000000"/>
                 <w:sz w:val="16"/>
               </w:rPr>
-              <w:t>Meghan Kilcoyne (D-Clinton)</w:t>
+              <w:t>Mark D. Sylvia (D-Fairhaven)</w:t>
             </w:r>
             <w:r>
               <w:rPr>
@@ -8078,7 +8078,7 @@
                 <w:color w:val="000000"/>
                 <w:sz w:val="16"/>
               </w:rPr>
-              <w:t>Lisa K. Mair (R-Berlin)</w:t>
+              <w:t>Brendalee A. Smith (R-Fairhaven)</w:t>
             </w:r>
           </w:p>
         </w:tc>
@@ -8106,7 +8106,7 @@
                 <w:color w:val="000000"/>
                 <w:sz w:val="16"/>
               </w:rPr>
-              <w:t>97.3%</w:t>
+              <w:t>97.2%</w:t>
             </w:r>
           </w:p>
         </w:tc>
@@ -8134,7 +8134,7 @@
                 <w:color w:val="000000"/>
                 <w:sz w:val="16"/>
               </w:rPr>
-              <w:t>+25.1</w:t>
+              <w:t>+24.7</w:t>
             </w:r>
           </w:p>
         </w:tc>
@@ -8162,7 +8162,7 @@
                 <w:color w:val="000000"/>
                 <w:sz w:val="16"/>
               </w:rPr>
-              <w:t>[+3.8, +46.4]</w:t>
+              <w:t>[+3.5, +46.0]</w:t>
             </w:r>
           </w:p>
         </w:tc>
@@ -8221,7 +8221,7 @@
                 <w:color w:val="000000"/>
                 <w:sz w:val="16"/>
               </w:rPr>
-              <w:t>Senate</w:t>
+              <w:t>House</w:t>
             </w:r>
           </w:p>
         </w:tc>
@@ -8248,7 +8248,7 @@
                 <w:color w:val="000000"/>
                 <w:sz w:val="16"/>
               </w:rPr>
-              <w:t>Plymouth and Barnstable</w:t>
+              <w:t>4th Worcester</w:t>
             </w:r>
           </w:p>
         </w:tc>
@@ -8275,7 +8275,7 @@
                 <w:color w:val="000000"/>
                 <w:sz w:val="16"/>
               </w:rPr>
-              <w:t>Dylan A. Fernandes (D-Falmouth)</w:t>
+              <w:t>Natalie Marie Higgins (D-Leominster)</w:t>
             </w:r>
             <w:r>
               <w:rPr>
@@ -8308,7 +8308,7 @@
                 <w:color w:val="000000"/>
                 <w:sz w:val="16"/>
               </w:rPr>
-              <w:t>Kari Della MacRae (R-Bourne)</w:t>
+              <w:t>Josh William Bowdridge (R-Leominster)</w:t>
             </w:r>
           </w:p>
         </w:tc>
@@ -8335,7 +8335,7 @@
                 <w:color w:val="000000"/>
                 <w:sz w:val="16"/>
               </w:rPr>
-              <w:t>97.3%</w:t>
+              <w:t>97.5%</w:t>
             </w:r>
           </w:p>
         </w:tc>
@@ -8362,7 +8362,7 @@
                 <w:color w:val="000000"/>
                 <w:sz w:val="16"/>
               </w:rPr>
-              <w:t>+25.5</w:t>
+              <w:t>+25.0</w:t>
             </w:r>
           </w:p>
         </w:tc>
@@ -8389,7 +8389,7 @@
                 <w:color w:val="000000"/>
                 <w:sz w:val="16"/>
               </w:rPr>
-              <w:t>[+4.0, +46.8]</w:t>
+              <w:t>[+3.8, +46.3]</w:t>
             </w:r>
           </w:p>
         </w:tc>
@@ -8478,7 +8478,7 @@
                 <w:color w:val="000000"/>
                 <w:sz w:val="16"/>
               </w:rPr>
-              <w:t>2nd Essex</w:t>
+              <w:t>16th Middlesex</w:t>
             </w:r>
           </w:p>
         </w:tc>
@@ -8506,13 +8506,7 @@
                 <w:color w:val="000000"/>
                 <w:sz w:val="16"/>
               </w:rPr>
-              <w:t>Kristin Elena Kassner (D-Hamilton)</w:t>
-            </w:r>
-            <w:r>
-              <w:rPr>
-                <w:vertAlign w:val="superscript"/>
-              </w:rPr>
-              <w:t>*</w:t>
+              <w:t>Lorena G. Betts (D-Chelmsford)</w:t>
             </w:r>
           </w:p>
         </w:tc>
@@ -8540,7 +8534,7 @@
                 <w:color w:val="000000"/>
                 <w:sz w:val="16"/>
               </w:rPr>
-              <w:t>Daniel James Kelly (R-Ipswich)</w:t>
+              <w:t>Karla J. Miller (R-Lowell)</w:t>
             </w:r>
           </w:p>
         </w:tc>
@@ -8568,7 +8562,7 @@
                 <w:color w:val="000000"/>
                 <w:sz w:val="16"/>
               </w:rPr>
-              <w:t>97.4%</w:t>
+              <w:t>97.9%</w:t>
             </w:r>
           </w:p>
         </w:tc>
@@ -8596,7 +8590,7 @@
                 <w:color w:val="000000"/>
                 <w:sz w:val="16"/>
               </w:rPr>
-              <w:t>+25.6</w:t>
+              <w:t>+25.9</w:t>
             </w:r>
           </w:p>
         </w:tc>
@@ -8624,7 +8618,7 @@
                 <w:color w:val="000000"/>
                 <w:sz w:val="16"/>
               </w:rPr>
-              <w:t>[+4.0, +46.8]</w:t>
+              <w:t>[+4.8, +46.8]</w:t>
             </w:r>
           </w:p>
         </w:tc>
@@ -8683,7 +8677,7 @@
                 <w:color w:val="000000"/>
                 <w:sz w:val="16"/>
               </w:rPr>
-              <w:t>House</w:t>
+              <w:t>Senate</w:t>
             </w:r>
           </w:p>
         </w:tc>
@@ -8710,7 +8704,7 @@
                 <w:color w:val="000000"/>
                 <w:sz w:val="16"/>
               </w:rPr>
-              <w:t>4th Worcester</w:t>
+              <w:t>1st Middlesex</w:t>
             </w:r>
           </w:p>
         </w:tc>
@@ -8737,7 +8731,7 @@
                 <w:color w:val="000000"/>
                 <w:sz w:val="16"/>
               </w:rPr>
-              <w:t>Natalie Marie Higgins (D-Leominster)</w:t>
+              <w:t>Vanna Howard (D-Lowell)</w:t>
             </w:r>
             <w:r>
               <w:rPr>
@@ -8770,7 +8764,7 @@
                 <w:color w:val="000000"/>
                 <w:sz w:val="16"/>
               </w:rPr>
-              <w:t>Josh William Bowdridge (R-Leominster)</w:t>
+              <w:t>Sam Meas (R-Lowell)</w:t>
             </w:r>
           </w:p>
         </w:tc>
@@ -8797,7 +8791,7 @@
                 <w:color w:val="000000"/>
                 <w:sz w:val="16"/>
               </w:rPr>
-              <w:t>97.5%</w:t>
+              <w:t>98.0%</w:t>
             </w:r>
           </w:p>
         </w:tc>
@@ -8824,7 +8818,7 @@
                 <w:color w:val="000000"/>
                 <w:sz w:val="16"/>
               </w:rPr>
-              <w:t>+25.8</w:t>
+              <w:t>+26.0</w:t>
             </w:r>
           </w:p>
         </w:tc>
@@ -8851,7 +8845,7 @@
                 <w:color w:val="000000"/>
                 <w:sz w:val="16"/>
               </w:rPr>
-              <w:t>[+4.6, +47.5]</w:t>
+              <w:t>[+5.2, +47.2]</w:t>
             </w:r>
           </w:p>
         </w:tc>
@@ -8940,7 +8934,7 @@
                 <w:color w:val="000000"/>
                 <w:sz w:val="16"/>
               </w:rPr>
-              <w:t>16th Middlesex</w:t>
+              <w:t>6th Worcester</w:t>
             </w:r>
           </w:p>
         </w:tc>
@@ -8968,7 +8962,7 @@
                 <w:color w:val="000000"/>
                 <w:sz w:val="16"/>
               </w:rPr>
-              <w:t>Lorena G. Betts (D-Chelmsford)</w:t>
+              <w:t>Jeanne Renaud Costello (D-Charlton)</w:t>
             </w:r>
           </w:p>
         </w:tc>
@@ -8996,7 +8990,13 @@
                 <w:color w:val="000000"/>
                 <w:sz w:val="16"/>
               </w:rPr>
-              <w:t>Karla J. Miller (R-Lowell)</w:t>
+              <w:t>John J. Marsi, Jr. (R-Charlton)</w:t>
+            </w:r>
+            <w:r>
+              <w:rPr>
+                <w:vertAlign w:val="superscript"/>
+              </w:rPr>
+              <w:t>*</w:t>
             </w:r>
           </w:p>
         </w:tc>
@@ -9024,7 +9024,7 @@
                 <w:color w:val="000000"/>
                 <w:sz w:val="16"/>
               </w:rPr>
-              <w:t>98.0%</w:t>
+              <w:t>1.6%</w:t>
             </w:r>
           </w:p>
         </w:tc>
@@ -9052,7 +9052,7 @@
                 <w:color w:val="000000"/>
                 <w:sz w:val="16"/>
               </w:rPr>
-              <w:t>+26.7</w:t>
+              <w:t>-27.9</w:t>
             </w:r>
           </w:p>
         </w:tc>
@@ -9080,7 +9080,7 @@
                 <w:color w:val="000000"/>
                 <w:sz w:val="16"/>
               </w:rPr>
-              <w:t>[+5.0, +48.7]</w:t>
+              <w:t>[-49.2, -6.6]</w:t>
             </w:r>
           </w:p>
         </w:tc>
@@ -9166,7 +9166,7 @@
                 <w:color w:val="000000"/>
                 <w:sz w:val="16"/>
               </w:rPr>
-              <w:t>2nd Essex and Middlesex</w:t>
+              <w:t>Plymouth and Barnstable</w:t>
             </w:r>
           </w:p>
         </w:tc>
@@ -9193,7 +9193,7 @@
                 <w:color w:val="000000"/>
                 <w:sz w:val="16"/>
               </w:rPr>
-              <w:t>Barry R. Finegold (D-Andover)</w:t>
+              <w:t>Dylan A. Fernandes (D-Falmouth)</w:t>
             </w:r>
             <w:r>
               <w:rPr>
@@ -9226,7 +9226,7 @@
                 <w:color w:val="000000"/>
                 <w:sz w:val="16"/>
               </w:rPr>
-              <w:t>Theodore T. Semesnyei (R-Amesbury)</w:t>
+              <w:t>Kari Della MacRae (R-Bourne)</w:t>
             </w:r>
           </w:p>
         </w:tc>
@@ -9253,7 +9253,7 @@
                 <w:color w:val="000000"/>
                 <w:sz w:val="16"/>
               </w:rPr>
-              <w:t>99.1%</w:t>
+              <w:t>98.8%</w:t>
             </w:r>
           </w:p>
         </w:tc>
@@ -9280,7 +9280,7 @@
                 <w:color w:val="000000"/>
                 <w:sz w:val="16"/>
               </w:rPr>
-              <w:t>+32.0</w:t>
+              <w:t>+28.5</w:t>
             </w:r>
           </w:p>
         </w:tc>
@@ -9307,7 +9307,7 @@
                 <w:color w:val="000000"/>
                 <w:sz w:val="16"/>
               </w:rPr>
-              <w:t>[+9.8, +54.3]</w:t>
+              <w:t>[+7.9, +49.5]</w:t>
             </w:r>
           </w:p>
         </w:tc>
@@ -9368,7 +9368,7 @@
                 <w:color w:val="000000"/>
                 <w:sz w:val="16"/>
               </w:rPr>
-              <w:t>House</w:t>
+              <w:t>Senate</w:t>
             </w:r>
           </w:p>
         </w:tc>
@@ -9396,7 +9396,7 @@
                 <w:color w:val="000000"/>
                 <w:sz w:val="16"/>
               </w:rPr>
-              <w:t>31st Middlesex</w:t>
+              <w:t>2nd Essex and Middlesex</w:t>
             </w:r>
           </w:p>
         </w:tc>
@@ -9424,7 +9424,7 @@
                 <w:color w:val="000000"/>
                 <w:sz w:val="16"/>
               </w:rPr>
-              <w:t>Michael Seamus Day (D-Stoneham)</w:t>
+              <w:t>Barry R. Finegold (D-Andover)</w:t>
             </w:r>
             <w:r>
               <w:rPr>
@@ -9458,7 +9458,7 @@
                 <w:color w:val="000000"/>
                 <w:sz w:val="16"/>
               </w:rPr>
-              <w:t>Stephen G. Ternullo (R-Stoneham)</w:t>
+              <w:t>Theodore T. Semesnyei (R-Amesbury)</w:t>
             </w:r>
           </w:p>
         </w:tc>
@@ -9486,7 +9486,7 @@
                 <w:color w:val="000000"/>
                 <w:sz w:val="16"/>
               </w:rPr>
-              <w:t>99.7%</w:t>
+              <w:t>99.5%</w:t>
             </w:r>
           </w:p>
         </w:tc>
@@ -9514,7 +9514,7 @@
                 <w:color w:val="000000"/>
                 <w:sz w:val="16"/>
               </w:rPr>
-              <w:t>+34.8</w:t>
+              <w:t>+33.2</w:t>
             </w:r>
           </w:p>
         </w:tc>
@@ -9542,7 +9542,7 @@
                 <w:color w:val="000000"/>
                 <w:sz w:val="16"/>
               </w:rPr>
-              <w:t>[+13.3, +56.1]</w:t>
+              <w:t>[+11.9, +54.6]</w:t>
             </w:r>
           </w:p>
         </w:tc>
@@ -9628,7 +9628,7 @@
                 <w:color w:val="000000"/>
                 <w:sz w:val="16"/>
               </w:rPr>
-              <w:t>5th Essex</w:t>
+              <w:t>31st Middlesex</w:t>
             </w:r>
           </w:p>
         </w:tc>
@@ -9655,7 +9655,7 @@
                 <w:color w:val="000000"/>
                 <w:sz w:val="16"/>
               </w:rPr>
-              <w:t>Andrew Francis Robert Tarr (D-Gloucester)</w:t>
+              <w:t>Michael Seamus Day (D-Stoneham)</w:t>
             </w:r>
             <w:r>
               <w:rPr>
@@ -9688,7 +9688,7 @@
                 <w:color w:val="000000"/>
                 <w:sz w:val="16"/>
               </w:rPr>
-              <w:t>Christina Delisio (R-Manchester-By-The-Sea)</w:t>
+              <w:t>Stephen G. Ternullo (R-Stoneham)</w:t>
             </w:r>
           </w:p>
         </w:tc>
@@ -9715,7 +9715,7 @@
                 <w:color w:val="000000"/>
                 <w:sz w:val="16"/>
               </w:rPr>
-              <w:t>99.8%</w:t>
+              <w:t>99.6%</w:t>
             </w:r>
           </w:p>
         </w:tc>
@@ -9742,7 +9742,7 @@
                 <w:color w:val="000000"/>
                 <w:sz w:val="16"/>
               </w:rPr>
-              <w:t>+38.5</w:t>
+              <w:t>+34.5</w:t>
             </w:r>
           </w:p>
         </w:tc>
@@ -9769,7 +9769,7 @@
                 <w:color w:val="000000"/>
                 <w:sz w:val="16"/>
               </w:rPr>
-              <w:t>[+16.6, +60.0]</w:t>
+              <w:t>[+13.4, +55.5]</w:t>
             </w:r>
           </w:p>
         </w:tc>
@@ -9858,7 +9858,7 @@
                 <w:color w:val="000000"/>
                 <w:sz w:val="16"/>
               </w:rPr>
-              <w:t>10th Bristol</w:t>
+              <w:t>5th Essex</w:t>
             </w:r>
           </w:p>
         </w:tc>
@@ -9886,7 +9886,7 @@
                 <w:color w:val="000000"/>
                 <w:sz w:val="16"/>
               </w:rPr>
-              <w:t>Mark D. Sylvia (D-Fairhaven)</w:t>
+              <w:t>Andrew Francis Robert Tarr (D-Gloucester)</w:t>
             </w:r>
             <w:r>
               <w:rPr>
@@ -9920,7 +9920,7 @@
                 <w:color w:val="000000"/>
                 <w:sz w:val="16"/>
               </w:rPr>
-              <w:t>Brendalee A. Smith (R-Fairhaven)</w:t>
+              <w:t>Christina Delisio (R-Manchester-By-The-Sea)</w:t>
             </w:r>
           </w:p>
         </w:tc>
@@ -9976,7 +9976,7 @@
                 <w:color w:val="000000"/>
                 <w:sz w:val="16"/>
               </w:rPr>
-              <w:t>+43.8</w:t>
+              <w:t>+38.6</w:t>
             </w:r>
           </w:p>
         </w:tc>
@@ -10004,7 +10004,7 @@
                 <w:color w:val="000000"/>
                 <w:sz w:val="16"/>
               </w:rPr>
-              <w:t>[+21.9, +65.6]</w:t>
+              <w:t>[+17.4, +59.5]</w:t>
             </w:r>
           </w:p>
         </w:tc>
@@ -10177,7 +10177,7 @@
                 <w:color w:val="000000"/>
                 <w:sz w:val="16"/>
               </w:rPr>
-              <w:t>99.9%</w:t>
+              <w:t>100.0%</w:t>
             </w:r>
           </w:p>
         </w:tc>
@@ -10204,7 +10204,7 @@
                 <w:color w:val="000000"/>
                 <w:sz w:val="16"/>
               </w:rPr>
-              <w:t>+44.9</w:t>
+              <w:t>+45.8</w:t>
             </w:r>
           </w:p>
         </w:tc>
@@ -10231,7 +10231,7 @@
                 <w:color w:val="000000"/>
                 <w:sz w:val="16"/>
               </w:rPr>
-              <w:t>[+23.0, +66.4]</w:t>
+              <w:t>[+24.8, +67.1]</w:t>
             </w:r>
           </w:p>
         </w:tc>
@@ -10320,7 +10320,7 @@
                 <w:color w:val="000000"/>
                 <w:sz w:val="16"/>
               </w:rPr>
-              <w:t>5th Middlesex</w:t>
+              <w:t>35th Middlesex</w:t>
             </w:r>
           </w:p>
         </w:tc>
@@ -10348,7 +10348,7 @@
                 <w:color w:val="000000"/>
                 <w:sz w:val="16"/>
               </w:rPr>
-              <w:t>David Paul Linsky (D-Natick)</w:t>
+              <w:t>Paul J. Donato (D-Medford)</w:t>
             </w:r>
             <w:r>
               <w:rPr>
@@ -10382,7 +10382,7 @@
                 <w:color w:val="000000"/>
                 <w:sz w:val="16"/>
               </w:rPr>
-              <w:t>Luisa A. Cestari (R-Natick)</w:t>
+              <w:t>James C. Seibel (R-Medford)</w:t>
             </w:r>
           </w:p>
         </w:tc>
@@ -10438,7 +10438,7 @@
                 <w:color w:val="000000"/>
                 <w:sz w:val="16"/>
               </w:rPr>
-              <w:t>+54.1</w:t>
+              <w:t>+60.0</w:t>
             </w:r>
           </w:p>
         </w:tc>
@@ -10466,7 +10466,7 @@
                 <w:color w:val="000000"/>
                 <w:sz w:val="16"/>
               </w:rPr>
-              <w:t>[+32.7, +75.3]</w:t>
+              <w:t>[+38.7, +80.7]</w:t>
             </w:r>
           </w:p>
         </w:tc>
@@ -10525,7 +10525,7 @@
                 <w:color w:val="000000"/>
                 <w:sz w:val="16"/>
               </w:rPr>
-              <w:t>Senate</w:t>
+              <w:t>House</w:t>
             </w:r>
           </w:p>
         </w:tc>
@@ -10552,7 +10552,7 @@
                 <w:color w:val="000000"/>
                 <w:sz w:val="16"/>
               </w:rPr>
-              <w:t>Middlesex and Worcester</w:t>
+              <w:t>5th Middlesex</w:t>
             </w:r>
           </w:p>
         </w:tc>
@@ -10579,7 +10579,7 @@
                 <w:color w:val="000000"/>
                 <w:sz w:val="16"/>
               </w:rPr>
-              <w:t>James Bradley Eldridge (D-Marlborough)</w:t>
+              <w:t>David Paul Linsky (D-Natick)</w:t>
             </w:r>
             <w:r>
               <w:rPr>
@@ -10612,7 +10612,7 @@
                 <w:color w:val="000000"/>
                 <w:sz w:val="16"/>
               </w:rPr>
-              <w:t>Joseph Timothy Shea (R-Acton)</w:t>
+              <w:t>Luisa A. Cestari (R-Natick)</w:t>
             </w:r>
           </w:p>
         </w:tc>
@@ -10666,7 +10666,7 @@
                 <w:color w:val="000000"/>
                 <w:sz w:val="16"/>
               </w:rPr>
-              <w:t>+54.3</w:t>
+              <w:t>+55.4</w:t>
             </w:r>
           </w:p>
         </w:tc>
@@ -10693,7 +10693,7 @@
                 <w:color w:val="000000"/>
                 <w:sz w:val="16"/>
               </w:rPr>
-              <w:t>[+32.4, +75.8]</w:t>
+              <w:t>[+33.9, +76.5]</w:t>
             </w:r>
           </w:p>
         </w:tc>
@@ -10754,7 +10754,7 @@
                 <w:color w:val="000000"/>
                 <w:sz w:val="16"/>
               </w:rPr>
-              <w:t>House</w:t>
+              <w:t>Senate</w:t>
             </w:r>
           </w:p>
         </w:tc>
@@ -10782,7 +10782,7 @@
                 <w:color w:val="000000"/>
                 <w:sz w:val="16"/>
               </w:rPr>
-              <w:t>35th Middlesex</w:t>
+              <w:t>Middlesex and Worcester</w:t>
             </w:r>
           </w:p>
         </w:tc>
@@ -10810,7 +10810,7 @@
                 <w:color w:val="000000"/>
                 <w:sz w:val="16"/>
               </w:rPr>
-              <w:t>Paul J. Donato (D-Medford)</w:t>
+              <w:t>James Bradley Eldridge (D-Marlborough)</w:t>
             </w:r>
             <w:r>
               <w:rPr>
@@ -10844,7 +10844,7 @@
                 <w:color w:val="000000"/>
                 <w:sz w:val="16"/>
               </w:rPr>
-              <w:t>James C. Seibel (R-Medford)</w:t>
+              <w:t>Joseph Timothy Shea (R-Acton)</w:t>
             </w:r>
           </w:p>
         </w:tc>
@@ -10900,7 +10900,7 @@
                 <w:color w:val="000000"/>
                 <w:sz w:val="16"/>
               </w:rPr>
-              <w:t>+55.8</w:t>
+              <w:t>+56.2</w:t>
             </w:r>
           </w:p>
         </w:tc>
@@ -10928,7 +10928,7 @@
                 <w:color w:val="000000"/>
                 <w:sz w:val="16"/>
               </w:rPr>
-              <w:t>[+34.3, +77.2]</w:t>
+              <w:t>[+35.2, +77.1]</w:t>
             </w:r>
           </w:p>
         </w:tc>
@@ -10937,6 +10937,25 @@
     <w:p>
       <w:r>
         <w:br w:type="page"/>
+      </w:r>
+    </w:p>
+    <w:p>
+      <w:pPr>
+        <w:pStyle w:val="Heading1"/>
+      </w:pPr>
+      <w:r>
+        <w:t>Change from the 60-day snapshot</w:t>
+      </w:r>
+    </w:p>
+    <w:p>
+      <w:r>
+        <w:rPr>
+          <w:b/>
+        </w:rPr>
+        <w:t xml:space="preserve">Snapshot comparison  </w:t>
+      </w:r>
+      <w:r>
+        <w:t>The 60-day snapshot, frozen at the 2026-09-04 finance cutoff, averaged 31.0 Democratic wins; the 14-day snapshot averages 31.3. The average race margin moved 1.6 points. The largest moves were 10th Bristol (+43.8 to +24.7), 1st Bristol and Plymouth (+14.9 to +20.1), and 35th Middlesex (+55.8 to +60.0). The 10th Bristol move follows the opponent's receipts rising from zero to $3,950, which sharply narrows a log receipt ratio that began at an extreme. Both snapshots remain published unchanged.</w:t>
       </w:r>
     </w:p>
     <w:p>
@@ -10955,7 +10974,7 @@
         <w:t xml:space="preserve">Model  </w:t>
       </w:r>
       <w:r>
-        <w:t>The forecast uses a Bayesian Gaussian regression of Democratic margin on district PVI, incumbency, and the log ratio of Democratic to opponent receipts measured 60 days before the election. It was trained on eligible completed races through November 5, 2024.</w:t>
+        <w:t>The forecast uses a Bayesian Gaussian regression of Democratic margin on district PVI, incumbency, and the log ratio of Democratic to opponent receipts measured 14 days before the election, over the trailing 365 days. It was trained on eligible completed races through November 5, 2024.</w:t>
       </w:r>
     </w:p>
     <w:p>
@@ -10999,6 +11018,20 @@
         <w:t xml:space="preserve">Forecast snapshot  </w:t>
       </w:r>
       <w:r>
+        <w:t>data/forecast/2026/snapshots/14d</w:t>
+      </w:r>
+    </w:p>
+    <w:p>
+      <w:pPr>
+        <w:spacing w:after="0"/>
+      </w:pPr>
+      <w:r>
+        <w:rPr>
+          <w:b/>
+        </w:rPr>
+        <w:t xml:space="preserve">Earlier snapshot  </w:t>
+      </w:r>
+      <w:r>
         <w:t>data/forecast/2026/snapshots/60d</w:t>
       </w:r>
     </w:p>
@@ -11027,7 +11060,7 @@
         <w:t xml:space="preserve">Snapshot code revision  </w:t>
       </w:r>
       <w:r>
-        <w:t>a315405172a6e70c90c2c55b6eaa55d2db77de5f</w:t>
+        <w:t>49b650e90578d772903e06be9849fe5549e30717</w:t>
       </w:r>
     </w:p>
     <w:p>

</xml_diff>